<commit_message>
added new resume structure
</commit_message>
<xml_diff>
--- a/resumes/ai-architect/brian-hannigan-ai-architect.docx
+++ b/resumes/ai-architect/brian-hannigan-ai-architect.docx
@@ -22,7 +22,7 @@
         <w:rPr>
           <w:sz w:val="21"/>
         </w:rPr>
-        <w:t>Remote | 07876 | (862) 243-1177 | jobshannigan@gmail.com</w:t>
+        <w:t>(862) 243-1177</w:t>
       </w:r>
     </w:p>
     <w:p>
@@ -33,7 +33,29 @@
         <w:rPr>
           <w:sz w:val="21"/>
         </w:rPr>
-        <w:t>LinkedIn: linkedin.com/in/brianjhannigan | GitHub: github.com/brianhannigan</w:t>
+        <w:t>jobshannigan@gmail.com</w:t>
+      </w:r>
+    </w:p>
+    <w:p>
+      <w:pPr>
+        <w:jc w:val="center"/>
+      </w:pPr>
+      <w:r>
+        <w:rPr>
+          <w:sz w:val="21"/>
+        </w:rPr>
+        <w:t>github.com/brianhannigan</w:t>
+      </w:r>
+    </w:p>
+    <w:p>
+      <w:pPr>
+        <w:jc w:val="center"/>
+      </w:pPr>
+      <w:r>
+        <w:rPr>
+          <w:sz w:val="21"/>
+        </w:rPr>
+        <w:t>linkedin.com/in/brianjhannigan</w:t>
       </w:r>
     </w:p>
     <w:p>
@@ -42,24 +64,36 @@
           <w:b/>
           <w:sz w:val="23"/>
         </w:rPr>
-        <w:t>PROFESSIONAL SUMMARY</w:t>
-      </w:r>
-    </w:p>
-    <w:p>
-      <w:r>
-        <w:rPr>
-          <w:sz w:val="21"/>
-        </w:rPr>
-        <w:t>AI Systems Architect and offline-first builder focused on practical AI integration, model orchestration, and deployable workflows. Experienced delivering AI-enabled services (OCR + translation) with strong emphasis on reliability, security boundaries, and documentation.</w:t>
+        <w:t>EXPERIENCE</w:t>
       </w:r>
     </w:p>
     <w:p>
       <w:r>
         <w:rPr>
           <w:b/>
-          <w:sz w:val="23"/>
+          <w:sz w:val="21"/>
         </w:rPr>
-        <w:t>CORE SKILLS</w:t>
+        <w:t>Company: Log(N) Pacific</w:t>
+        <w:tab/>
+        <w:t>2025 – Present</w:t>
+      </w:r>
+    </w:p>
+    <w:p>
+      <w:r>
+        <w:rPr>
+          <w:b/>
+          <w:sz w:val="21"/>
+        </w:rPr>
+        <w:t>Title: Cyber Security Support Analyst (Vulnerability Management &amp; SecOps Intern)</w:t>
+      </w:r>
+    </w:p>
+    <w:p>
+      <w:r>
+        <w:rPr>
+          <w:b/>
+          <w:sz w:val="21"/>
+        </w:rPr>
+        <w:t>Vulnerability Management:</w:t>
       </w:r>
     </w:p>
     <w:p>
@@ -70,7 +104,7 @@
         <w:rPr>
           <w:sz w:val="21"/>
         </w:rPr>
-        <w:t>AI Systems: model orchestration, offline-first deployment patterns, pipeline design</w:t>
+        <w:t>Conducted vulnerability scans and provided detailed remediation reports, contributing to a 100% reduction in critical, 90% reduction in high, and 76% reduction in medium vulnerabilities.</w:t>
       </w:r>
     </w:p>
     <w:p>
@@ -81,7 +115,7 @@
         <w:rPr>
           <w:sz w:val="21"/>
         </w:rPr>
-        <w:t>APIs &amp; Services: REST, JSON, modular service boundaries, logging and observability</w:t>
+        <w:t>Performed vulnerability assessments and risk prioritization using Tenable across Windows and Linux environments.</w:t>
       </w:r>
     </w:p>
     <w:p>
@@ -92,7 +126,7 @@
         <w:rPr>
           <w:sz w:val="21"/>
         </w:rPr>
-        <w:t>Automation: scripting, repeatable deployments, configuration management patterns</w:t>
+        <w:t>Executed secure configurations and compliance audits (DISA STIG) using Tenable to meet industry standards.</w:t>
       </w:r>
     </w:p>
     <w:p>
@@ -103,7 +137,16 @@
         <w:rPr>
           <w:sz w:val="21"/>
         </w:rPr>
-        <w:t>Tools: Python, Docker, Git, Windows/Linux</w:t>
+        <w:t>Automated remediation processes and STIG implementations using PowerShell to address critical vulnerabilities.</w:t>
+      </w:r>
+    </w:p>
+    <w:p>
+      <w:r>
+        <w:rPr>
+          <w:b/>
+          <w:sz w:val="21"/>
+        </w:rPr>
+        <w:t>Security Operations:</w:t>
       </w:r>
     </w:p>
     <w:p>
@@ -114,16 +157,7 @@
         <w:rPr>
           <w:sz w:val="21"/>
         </w:rPr>
-        <w:t>Communication: executive briefings, documentation, training and enablement</w:t>
-      </w:r>
-    </w:p>
-    <w:p>
-      <w:r>
-        <w:rPr>
-          <w:b/>
-          <w:sz w:val="23"/>
-        </w:rPr>
-        <w:t>FLAGSHIP AI PROJECT</w:t>
+        <w:t>Performed threat hunting using EDR, identifying indicators of brute force attacks, data exfiltration, and ransomware activity.</w:t>
       </w:r>
     </w:p>
     <w:p>
@@ -134,7 +168,284 @@
         <w:rPr>
           <w:sz w:val="21"/>
         </w:rPr>
-        <w:t>Portable Translator — Offline AI translation + OCR orchestration (GitHub: github.com/brianhannigan/translator)</w:t>
+        <w:t>Designed and tested advanced threat hunting scenarios for incident response tabletop exercises.</w:t>
+      </w:r>
+    </w:p>
+    <w:p>
+      <w:pPr>
+        <w:pStyle w:val="ListBullet"/>
+      </w:pPr>
+      <w:r>
+        <w:rPr>
+          <w:sz w:val="21"/>
+        </w:rPr>
+        <w:t>Developed custom detection rules in Microsoft Defender for Endpoint to automate isolation and investigation of compromised systems.</w:t>
+      </w:r>
+    </w:p>
+    <w:p>
+      <w:pPr>
+        <w:pStyle w:val="ListBullet"/>
+      </w:pPr>
+      <w:r>
+        <w:rPr>
+          <w:sz w:val="21"/>
+        </w:rPr>
+        <w:t>Reduced brute force incidents by 100% by implementing inbound NSG/firewall rules to limit Internet exposure.</w:t>
+      </w:r>
+    </w:p>
+    <w:p>
+      <w:pPr>
+        <w:pStyle w:val="ListBullet"/>
+      </w:pPr>
+      <w:r>
+        <w:rPr>
+          <w:sz w:val="21"/>
+        </w:rPr>
+        <w:t>Created Microsoft Sentinel dashboards to monitor logon failures and malicious traffic using threat intelligence.</w:t>
+      </w:r>
+    </w:p>
+    <w:p>
+      <w:pPr>
+        <w:pStyle w:val="ListBullet"/>
+      </w:pPr>
+      <w:r>
+        <w:rPr>
+          <w:sz w:val="21"/>
+        </w:rPr>
+        <w:t>Utilized KQL to query logs within SIEM and EDR platforms for investigation and detection purposes.</w:t>
+      </w:r>
+    </w:p>
+    <w:p>
+      <w:r>
+        <w:rPr>
+          <w:b/>
+          <w:sz w:val="21"/>
+        </w:rPr>
+        <w:t>Company: Independent Consulting</w:t>
+        <w:tab/>
+        <w:t>Various</w:t>
+      </w:r>
+    </w:p>
+    <w:p>
+      <w:r>
+        <w:rPr>
+          <w:b/>
+          <w:sz w:val="21"/>
+        </w:rPr>
+        <w:t>Title: Software Engineer / Security &amp; Automation Consultant</w:t>
+      </w:r>
+    </w:p>
+    <w:p>
+      <w:r>
+        <w:rPr>
+          <w:b/>
+          <w:sz w:val="21"/>
+        </w:rPr>
+        <w:t>Automation &amp; AI-Adjacent Workflows:</w:t>
+      </w:r>
+    </w:p>
+    <w:p>
+      <w:pPr>
+        <w:pStyle w:val="ListBullet"/>
+      </w:pPr>
+      <w:r>
+        <w:rPr>
+          <w:sz w:val="21"/>
+        </w:rPr>
+        <w:t>Designed workflow automation patterns suitable for offline-first and constrained environments.</w:t>
+      </w:r>
+    </w:p>
+    <w:p>
+      <w:pPr>
+        <w:pStyle w:val="ListBullet"/>
+      </w:pPr>
+      <w:r>
+        <w:rPr>
+          <w:sz w:val="21"/>
+        </w:rPr>
+        <w:t>Emphasized reliability, observability, and maintainable modular boundaries.</w:t>
+      </w:r>
+    </w:p>
+    <w:p>
+      <w:pPr>
+        <w:pStyle w:val="ListBullet"/>
+      </w:pPr>
+      <w:r>
+        <w:rPr>
+          <w:sz w:val="21"/>
+        </w:rPr>
+        <w:t>Delivered client-facing software and automation solutions with strong documentation and handoff discipline.</w:t>
+      </w:r>
+    </w:p>
+    <w:p>
+      <w:pPr>
+        <w:pStyle w:val="ListBullet"/>
+      </w:pPr>
+      <w:r>
+        <w:rPr>
+          <w:sz w:val="21"/>
+        </w:rPr>
+        <w:t>Built repeatable workflows, templates, and operational guides to reduce friction and improve consistency.</w:t>
+      </w:r>
+    </w:p>
+    <w:p>
+      <w:pPr>
+        <w:pStyle w:val="ListBullet"/>
+      </w:pPr>
+      <w:r>
+        <w:rPr>
+          <w:sz w:val="21"/>
+        </w:rPr>
+        <w:t>Partnered directly with stakeholders; translated ambiguous needs into clear technical deliverables.</w:t>
+      </w:r>
+    </w:p>
+    <w:p>
+      <w:r>
+        <w:rPr>
+          <w:b/>
+          <w:sz w:val="21"/>
+        </w:rPr>
+        <w:t>Company: UTRS, Inc</w:t>
+        <w:tab/>
+        <w:t>2011 – 2025</w:t>
+      </w:r>
+    </w:p>
+    <w:p>
+      <w:r>
+        <w:rPr>
+          <w:b/>
+          <w:sz w:val="21"/>
+        </w:rPr>
+        <w:t>Title: Technical Systems Engineer / Trainer / Systems Architect</w:t>
+      </w:r>
+    </w:p>
+    <w:p>
+      <w:r>
+        <w:rPr>
+          <w:b/>
+          <w:sz w:val="21"/>
+        </w:rPr>
+        <w:t>Systems Architecture:</w:t>
+      </w:r>
+    </w:p>
+    <w:p>
+      <w:pPr>
+        <w:pStyle w:val="ListBullet"/>
+      </w:pPr>
+      <w:r>
+        <w:rPr>
+          <w:sz w:val="21"/>
+        </w:rPr>
+        <w:t>Designed and delivered simulation training ecosystems for U.S. Government/DoD programs across multiple sites.</w:t>
+      </w:r>
+    </w:p>
+    <w:p>
+      <w:pPr>
+        <w:pStyle w:val="ListBullet"/>
+      </w:pPr>
+      <w:r>
+        <w:rPr>
+          <w:sz w:val="21"/>
+        </w:rPr>
+        <w:t>Built and sustained operator tooling, automation workflows, and repeatable deployment procedures.</w:t>
+      </w:r>
+    </w:p>
+    <w:p>
+      <w:pPr>
+        <w:pStyle w:val="ListBullet"/>
+      </w:pPr>
+      <w:r>
+        <w:rPr>
+          <w:sz w:val="21"/>
+        </w:rPr>
+        <w:t>Produced SOPs, technical documentation, and handoff-ready training materials for long-term sustainment.</w:t>
+      </w:r>
+    </w:p>
+    <w:p>
+      <w:pPr>
+        <w:pStyle w:val="ListBullet"/>
+      </w:pPr>
+      <w:r>
+        <w:rPr>
+          <w:sz w:val="21"/>
+        </w:rPr>
+        <w:t>Partnered with stakeholders to translate requirements into deliverable system outcomes.</w:t>
+      </w:r>
+    </w:p>
+    <w:p>
+      <w:pPr>
+        <w:pStyle w:val="ListBullet"/>
+      </w:pPr>
+      <w:r>
+        <w:rPr>
+          <w:sz w:val="21"/>
+        </w:rPr>
+        <w:t>Improved operational reliability through disciplined troubleshooting and root cause analysis.</w:t>
+      </w:r>
+    </w:p>
+    <w:p>
+      <w:r>
+        <w:rPr>
+          <w:b/>
+          <w:sz w:val="21"/>
+        </w:rPr>
+        <w:t>Reliability &amp; Sustainment:</w:t>
+      </w:r>
+    </w:p>
+    <w:p>
+      <w:pPr>
+        <w:pStyle w:val="ListBullet"/>
+      </w:pPr>
+      <w:r>
+        <w:rPr>
+          <w:sz w:val="21"/>
+        </w:rPr>
+        <w:t>Designed repeatable deployment patterns and documentation practices to support adoption and sustainment.</w:t>
+      </w:r>
+    </w:p>
+    <w:p>
+      <w:pPr>
+        <w:pStyle w:val="ListBullet"/>
+      </w:pPr>
+      <w:r>
+        <w:rPr>
+          <w:sz w:val="21"/>
+        </w:rPr>
+        <w:t>Emphasized deterministic behavior, logging, and supportability across delivered systems.</w:t>
+      </w:r>
+    </w:p>
+    <w:p>
+      <w:r>
+        <w:rPr>
+          <w:b/>
+          <w:sz w:val="23"/>
+        </w:rPr>
+        <w:t>PROJECTS</w:t>
+      </w:r>
+    </w:p>
+    <w:p>
+      <w:r>
+        <w:rPr>
+          <w:b/>
+          <w:sz w:val="21"/>
+        </w:rPr>
+        <w:t>Portable Translator — Offline OCR + Translation Services</w:t>
+      </w:r>
+    </w:p>
+    <w:p>
+      <w:r>
+        <w:rPr>
+          <w:sz w:val="21"/>
+        </w:rPr>
+        <w:t>Source: github.com/brianhannigan/translator</w:t>
+      </w:r>
+    </w:p>
+    <w:p>
+      <w:r>
+        <w:rPr>
+          <w:sz w:val="21"/>
+        </w:rPr>
+        <w:t>Platforms and Technology Used: Python, REST APIs, Tesseract OCR, Local Translation Engines, Git, Windows/Linux</w:t>
       </w:r>
     </w:p>
     <w:p>
@@ -189,7 +500,7 @@
         <w:rPr>
           <w:sz w:val="21"/>
         </w:rPr>
-        <w:t>Used Git for version control and iterative feature delivery; maintained clean repo organization and documentation.</w:t>
+        <w:t>Used Git for version control and maintained clean repo organization and documentation.</w:t>
       </w:r>
     </w:p>
     <w:p>
@@ -198,7 +509,7 @@
           <w:b/>
           <w:sz w:val="23"/>
         </w:rPr>
-        <w:t>EXPERIENCE</w:t>
+        <w:t>CERTIFICATIONS</w:t>
       </w:r>
     </w:p>
     <w:p>
@@ -209,7 +520,7 @@
         <w:rPr>
           <w:sz w:val="21"/>
         </w:rPr>
-        <w:t>UTRS, Inc — AI Advisor / Technical Systems Architect (2011–2025)</w:t>
+        <w:t>CompTIA Security+</w:t>
       </w:r>
     </w:p>
     <w:p>
@@ -220,7 +531,7 @@
         <w:rPr>
           <w:sz w:val="21"/>
         </w:rPr>
-        <w:t>Delivered training ecosystems and technical solutions with a strong focus on operational reliability.</w:t>
+        <w:t>InfraGard Member</w:t>
       </w:r>
     </w:p>
     <w:p>
@@ -231,7 +542,7 @@
         <w:rPr>
           <w:sz w:val="21"/>
         </w:rPr>
-        <w:t>Created documentation, SOPs, and enablement materials supporting adoption and sustainment.</w:t>
+        <w:t>SOC Core Skills</w:t>
       </w:r>
     </w:p>
     <w:p>
@@ -242,16 +553,7 @@
         <w:rPr>
           <w:sz w:val="21"/>
         </w:rPr>
-        <w:t>Applied compliance-minded practices and secure configuration expectations to deployments.</w:t>
-      </w:r>
-    </w:p>
-    <w:p>
-      <w:r>
-        <w:rPr>
-          <w:b/>
-          <w:sz w:val="23"/>
-        </w:rPr>
-        <w:t>SELECTED CAPABILITIES</w:t>
+        <w:t>Active Defense &amp; Cyber Deception</w:t>
       </w:r>
     </w:p>
     <w:p>
@@ -262,7 +564,7 @@
         <w:rPr>
           <w:sz w:val="21"/>
         </w:rPr>
-        <w:t>Workflow mapping and value mapping approaches for aligning automation/AI to measurable outcomes.</w:t>
+        <w:t>Red Team Summit</w:t>
       </w:r>
     </w:p>
     <w:p>
@@ -273,7 +575,7 @@
         <w:rPr>
           <w:sz w:val="21"/>
         </w:rPr>
-        <w:t>Risk-aware system design (security boundaries, reliability, maintainability).</w:t>
+        <w:t>Hacking Humans: Social Engineering &amp; Elicitation</w:t>
       </w:r>
     </w:p>
     <w:p>
@@ -293,7 +595,7 @@
         <w:rPr>
           <w:sz w:val="21"/>
         </w:rPr>
-        <w:t>M.Ed., Special Education — New Jersey City University</w:t>
+        <w:t>Master’s — New Jersey City University</w:t>
       </w:r>
     </w:p>
     <w:p>
@@ -304,16 +606,7 @@
         <w:rPr>
           <w:sz w:val="21"/>
         </w:rPr>
-        <w:t>B.S., Criminal Justice — University of Delaware</w:t>
-      </w:r>
-    </w:p>
-    <w:p>
-      <w:r>
-        <w:rPr>
-          <w:b/>
-          <w:sz w:val="23"/>
-        </w:rPr>
-        <w:t>CERTIFICATIONS</w:t>
+        <w:t>B.S. — University of Delaware</w:t>
       </w:r>
     </w:p>
     <w:p>
@@ -324,7 +617,324 @@
         <w:rPr>
           <w:sz w:val="21"/>
         </w:rPr>
-        <w:t>CompTIA Security+ • InfraGard Member • Continued AI/cyber professional development</w:t>
+        <w:t>Programming Diploma — Chubb Institute</w:t>
+      </w:r>
+    </w:p>
+    <w:p>
+      <w:r>
+        <w:rPr>
+          <w:b/>
+          <w:sz w:val="23"/>
+        </w:rPr>
+        <w:t>ADDITIONAL SKILLS AND TECHNOLOGIES</w:t>
+      </w:r>
+    </w:p>
+    <w:p>
+      <w:pPr>
+        <w:pStyle w:val="ListBullet"/>
+      </w:pPr>
+      <w:r>
+        <w:rPr>
+          <w:sz w:val="21"/>
+        </w:rPr>
+        <w:t>Endpoint Detection and Response (concepts)</w:t>
+      </w:r>
+    </w:p>
+    <w:p>
+      <w:pPr>
+        <w:pStyle w:val="ListBullet"/>
+      </w:pPr>
+      <w:r>
+        <w:rPr>
+          <w:sz w:val="21"/>
+        </w:rPr>
+        <w:t>Vulnerability Management</w:t>
+      </w:r>
+    </w:p>
+    <w:p>
+      <w:pPr>
+        <w:pStyle w:val="ListBullet"/>
+      </w:pPr>
+      <w:r>
+        <w:rPr>
+          <w:sz w:val="21"/>
+        </w:rPr>
+        <w:t>CVE/CWE Concepts</w:t>
+      </w:r>
+    </w:p>
+    <w:p>
+      <w:pPr>
+        <w:pStyle w:val="ListBullet"/>
+      </w:pPr>
+      <w:r>
+        <w:rPr>
+          <w:sz w:val="21"/>
+        </w:rPr>
+        <w:t>CVSS Concepts</w:t>
+      </w:r>
+    </w:p>
+    <w:p>
+      <w:pPr>
+        <w:pStyle w:val="ListBullet"/>
+      </w:pPr>
+      <w:r>
+        <w:rPr>
+          <w:sz w:val="21"/>
+        </w:rPr>
+        <w:t>Risk Prioritization</w:t>
+      </w:r>
+    </w:p>
+    <w:p>
+      <w:pPr>
+        <w:pStyle w:val="ListBullet"/>
+      </w:pPr>
+      <w:r>
+        <w:rPr>
+          <w:sz w:val="21"/>
+        </w:rPr>
+        <w:t>Remediation Tracking</w:t>
+      </w:r>
+    </w:p>
+    <w:p>
+      <w:pPr>
+        <w:pStyle w:val="ListBullet"/>
+      </w:pPr>
+      <w:r>
+        <w:rPr>
+          <w:sz w:val="21"/>
+        </w:rPr>
+        <w:t>PowerShell Scripting</w:t>
+      </w:r>
+    </w:p>
+    <w:p>
+      <w:pPr>
+        <w:pStyle w:val="ListBullet"/>
+      </w:pPr>
+      <w:r>
+        <w:rPr>
+          <w:sz w:val="21"/>
+        </w:rPr>
+        <w:t>Bash Scripting</w:t>
+      </w:r>
+    </w:p>
+    <w:p>
+      <w:pPr>
+        <w:pStyle w:val="ListBullet"/>
+      </w:pPr>
+      <w:r>
+        <w:rPr>
+          <w:sz w:val="21"/>
+        </w:rPr>
+        <w:t>Firewall/NSG Configuration</w:t>
+      </w:r>
+    </w:p>
+    <w:p>
+      <w:pPr>
+        <w:pStyle w:val="ListBullet"/>
+      </w:pPr>
+      <w:r>
+        <w:rPr>
+          <w:sz w:val="21"/>
+        </w:rPr>
+        <w:t>DISA STIG Alignment (audit concepts)</w:t>
+      </w:r>
+    </w:p>
+    <w:p>
+      <w:pPr>
+        <w:pStyle w:val="ListBullet"/>
+      </w:pPr>
+      <w:r>
+        <w:rPr>
+          <w:sz w:val="21"/>
+        </w:rPr>
+        <w:t>NIST Concepts</w:t>
+      </w:r>
+    </w:p>
+    <w:p>
+      <w:pPr>
+        <w:pStyle w:val="ListBullet"/>
+      </w:pPr>
+      <w:r>
+        <w:rPr>
+          <w:sz w:val="21"/>
+        </w:rPr>
+        <w:t>HIPAA Concepts</w:t>
+      </w:r>
+    </w:p>
+    <w:p>
+      <w:pPr>
+        <w:pStyle w:val="ListBullet"/>
+      </w:pPr>
+      <w:r>
+        <w:rPr>
+          <w:sz w:val="21"/>
+        </w:rPr>
+        <w:t>SOC 2 Concepts</w:t>
+      </w:r>
+    </w:p>
+    <w:p>
+      <w:pPr>
+        <w:pStyle w:val="ListBullet"/>
+      </w:pPr>
+      <w:r>
+        <w:rPr>
+          <w:sz w:val="21"/>
+        </w:rPr>
+        <w:t>Audit Trail Mindset</w:t>
+      </w:r>
+    </w:p>
+    <w:p>
+      <w:pPr>
+        <w:pStyle w:val="ListBullet"/>
+      </w:pPr>
+      <w:r>
+        <w:rPr>
+          <w:sz w:val="21"/>
+        </w:rPr>
+        <w:t>REST APIs</w:t>
+      </w:r>
+    </w:p>
+    <w:p>
+      <w:pPr>
+        <w:pStyle w:val="ListBullet"/>
+      </w:pPr>
+      <w:r>
+        <w:rPr>
+          <w:sz w:val="21"/>
+        </w:rPr>
+        <w:t>JSON</w:t>
+      </w:r>
+    </w:p>
+    <w:p>
+      <w:pPr>
+        <w:pStyle w:val="ListBullet"/>
+      </w:pPr>
+      <w:r>
+        <w:rPr>
+          <w:sz w:val="21"/>
+        </w:rPr>
+        <w:t>HTTP</w:t>
+      </w:r>
+    </w:p>
+    <w:p>
+      <w:pPr>
+        <w:pStyle w:val="ListBullet"/>
+      </w:pPr>
+      <w:r>
+        <w:rPr>
+          <w:sz w:val="21"/>
+        </w:rPr>
+        <w:t>Python</w:t>
+      </w:r>
+    </w:p>
+    <w:p>
+      <w:pPr>
+        <w:pStyle w:val="ListBullet"/>
+      </w:pPr>
+      <w:r>
+        <w:rPr>
+          <w:sz w:val="21"/>
+        </w:rPr>
+        <w:t>SQL</w:t>
+      </w:r>
+    </w:p>
+    <w:p>
+      <w:pPr>
+        <w:pStyle w:val="ListBullet"/>
+      </w:pPr>
+      <w:r>
+        <w:rPr>
+          <w:sz w:val="21"/>
+        </w:rPr>
+        <w:t>Git</w:t>
+      </w:r>
+    </w:p>
+    <w:p>
+      <w:pPr>
+        <w:pStyle w:val="ListBullet"/>
+      </w:pPr>
+      <w:r>
+        <w:rPr>
+          <w:sz w:val="21"/>
+        </w:rPr>
+        <w:t>Docker</w:t>
+      </w:r>
+    </w:p>
+    <w:p>
+      <w:pPr>
+        <w:pStyle w:val="ListBullet"/>
+      </w:pPr>
+      <w:r>
+        <w:rPr>
+          <w:sz w:val="21"/>
+        </w:rPr>
+        <w:t>Microsoft Sentinel (dashboards/queries)</w:t>
+      </w:r>
+    </w:p>
+    <w:p>
+      <w:pPr>
+        <w:pStyle w:val="ListBullet"/>
+      </w:pPr>
+      <w:r>
+        <w:rPr>
+          <w:sz w:val="21"/>
+        </w:rPr>
+        <w:t>Microsoft Defender for Endpoint (detections)</w:t>
+      </w:r>
+    </w:p>
+    <w:p>
+      <w:pPr>
+        <w:pStyle w:val="ListBullet"/>
+      </w:pPr>
+      <w:r>
+        <w:rPr>
+          <w:sz w:val="21"/>
+        </w:rPr>
+        <w:t>KQL (investigation/detection queries)</w:t>
+      </w:r>
+    </w:p>
+    <w:p>
+      <w:pPr>
+        <w:pStyle w:val="ListBullet"/>
+      </w:pPr>
+      <w:r>
+        <w:rPr>
+          <w:sz w:val="21"/>
+        </w:rPr>
+        <w:t>Offline-first Architecture</w:t>
+      </w:r>
+    </w:p>
+    <w:p>
+      <w:pPr>
+        <w:pStyle w:val="ListBullet"/>
+      </w:pPr>
+      <w:r>
+        <w:rPr>
+          <w:sz w:val="21"/>
+        </w:rPr>
+        <w:t>Workflow Orchestration</w:t>
+      </w:r>
+    </w:p>
+    <w:p>
+      <w:pPr>
+        <w:pStyle w:val="ListBullet"/>
+      </w:pPr>
+      <w:r>
+        <w:rPr>
+          <w:sz w:val="21"/>
+        </w:rPr>
+        <w:t>Reliability Engineering</w:t>
+      </w:r>
+    </w:p>
+    <w:p>
+      <w:pPr>
+        <w:pStyle w:val="ListBullet"/>
+      </w:pPr>
+      <w:r>
+        <w:rPr>
+          <w:sz w:val="21"/>
+        </w:rPr>
+        <w:t>Configuration Management</w:t>
       </w:r>
     </w:p>
     <w:sectPr>

</xml_diff>